<commit_message>
Update docs to reflect no-expiry access tokens
</commit_message>
<xml_diff>
--- a/docs/Mobile_API_Reference.docx
+++ b/docs/Mobile_API_Reference.docx
@@ -8842,7 +8842,41 @@
           <w:color w:val="555555"/>
           <w:sz w:val="19"/>
         </w:rPr>
-        <w:t>Access token expires in 7 days (refresh token in 30 days) — long-lived by design so this endpoint is rarely needed in practice. Re-connect the socket with the new token after refreshing, on the rare occasion you do use it.</w:t>
+        <w:t xml:space="preserve">Access tokens never expire (no </w:t>
+      </w:r>
+      <w:r>
+        <w:rPr>
+          <w:rFonts w:ascii="Consolas" w:hAnsi="Consolas"/>
+          <w:i/>
+          <w:color w:val="2A5CA8"/>
+          <w:sz w:val="19"/>
+        </w:rPr>
+        <w:t>exp</w:t>
+      </w:r>
+      <w:r>
+        <w:rPr>
+          <w:i/>
+          <w:color w:val="555555"/>
+          <w:sz w:val="19"/>
+        </w:rPr>
+        <w:t xml:space="preserve"> claim), by explicit request — this endpoint should essentially never be needed. Refresh tokens still expire after 30 days. Security trade-off: a leaked access token is valid forever; the only way to invalidate one is rotating </w:t>
+      </w:r>
+      <w:r>
+        <w:rPr>
+          <w:rFonts w:ascii="Consolas" w:hAnsi="Consolas"/>
+          <w:i/>
+          <w:color w:val="2A5CA8"/>
+          <w:sz w:val="19"/>
+        </w:rPr>
+        <w:t>JWT_ACCESS_SECRET</w:t>
+      </w:r>
+      <w:r>
+        <w:rPr>
+          <w:i/>
+          <w:color w:val="555555"/>
+          <w:sz w:val="19"/>
+        </w:rPr>
+        <w:t xml:space="preserve"> server-side, which logs out everyone, not just the affected user.</w:t>
       </w:r>
     </w:p>
     <w:p>

</xml_diff>

<commit_message>
Update docs to reflect no-refresh-token single-access-token auth
</commit_message>
<xml_diff>
--- a/docs/Mobile_API_Reference.docx
+++ b/docs/Mobile_API_Reference.docx
@@ -94,7 +94,7 @@
           <w:color w:val="2A5CA8"/>
           <w:sz w:val="21"/>
         </w:rPr>
-        <w:t>https://recovery-api.laggarsay.com/api/v1</w:t>
+        <w:t>https://api.recovernow.co.uk/api/v1</w:t>
       </w:r>
       <w:r>
         <w:rPr>
@@ -128,6 +128,55 @@
           <w:sz w:val="21"/>
         </w:rPr>
         <w:t>Authorization: Bearer &lt;accessToken&gt;</w:t>
+      </w:r>
+    </w:p>
+    <w:p>
+      <w:r>
+        <w:rPr>
+          <w:b/>
+          <w:i w:val="0"/>
+          <w:sz w:val="21"/>
+        </w:rPr>
+        <w:t>Tokens:</w:t>
+      </w:r>
+      <w:r>
+        <w:rPr>
+          <w:i w:val="0"/>
+          <w:sz w:val="21"/>
+        </w:rPr>
+        <w:t xml:space="preserve"> there is only one token. </w:t>
+      </w:r>
+      <w:r>
+        <w:rPr>
+          <w:rFonts w:ascii="Consolas" w:hAnsi="Consolas"/>
+          <w:i w:val="0"/>
+          <w:color w:val="2A5CA8"/>
+          <w:sz w:val="21"/>
+        </w:rPr>
+        <w:t>accessToken</w:t>
+      </w:r>
+      <w:r>
+        <w:rPr>
+          <w:i w:val="0"/>
+          <w:sz w:val="21"/>
+        </w:rPr>
+        <w:t xml:space="preserve"> from endpoint 2 (or </w:t>
+      </w:r>
+      <w:r>
+        <w:rPr>
+          <w:rFonts w:ascii="Consolas" w:hAnsi="Consolas"/>
+          <w:i w:val="0"/>
+          <w:color w:val="2A5CA8"/>
+          <w:sz w:val="21"/>
+        </w:rPr>
+        <w:t>/auth/login</w:t>
+      </w:r>
+      <w:r>
+        <w:rPr>
+          <w:i w:val="0"/>
+          <w:sz w:val="21"/>
+        </w:rPr>
+        <w:t xml:space="preserve"> for admin) never expires and there is no refresh token/endpoint anymore — get it once, store it, keep using it.</w:t>
       </w:r>
     </w:p>
     <w:p>
@@ -632,16 +681,6 @@
           <w:sz w:val="18"/>
         </w:rPr>
         <w:t xml:space="preserve">    "accessToken": "eyJhbGciOi...",</w:t>
-      </w:r>
-      <w:r>
-        <w:br/>
-      </w:r>
-      <w:r>
-        <w:rPr>
-          <w:rFonts w:ascii="Consolas" w:hAnsi="Consolas"/>
-          <w:sz w:val="18"/>
-        </w:rPr>
-        <w:t xml:space="preserve">    "refreshToken": "eyJhbGciOi...",</w:t>
       </w:r>
       <w:r>
         <w:br/>
@@ -8708,195 +8747,7 @@
         <w:rPr>
           <w:color w:val="2A5CA8"/>
         </w:rPr>
-        <w:t>33. Refresh Access Token</w:t>
-      </w:r>
-    </w:p>
-    <w:p>
-      <w:r>
-        <w:rPr>
-          <w:b/>
-          <w:i w:val="0"/>
-          <w:sz w:val="21"/>
-        </w:rPr>
-        <w:t>URL:</w:t>
-      </w:r>
-      <w:r>
-        <w:rPr>
-          <w:i w:val="0"/>
-          <w:sz w:val="21"/>
-        </w:rPr>
-        <w:t xml:space="preserve"> </w:t>
-      </w:r>
-      <w:r>
-        <w:rPr>
-          <w:rFonts w:ascii="Consolas" w:hAnsi="Consolas"/>
-          <w:i w:val="0"/>
-          <w:color w:val="2A5CA8"/>
-          <w:sz w:val="21"/>
-        </w:rPr>
-        <w:t>/auth/refresh</w:t>
-      </w:r>
-    </w:p>
-    <w:p>
-      <w:r>
-        <w:rPr>
-          <w:b/>
-          <w:i w:val="0"/>
-          <w:sz w:val="21"/>
-        </w:rPr>
-        <w:t>Method:</w:t>
-      </w:r>
-      <w:r>
-        <w:rPr>
-          <w:i w:val="0"/>
-          <w:sz w:val="21"/>
-        </w:rPr>
-        <w:t xml:space="preserve"> </w:t>
-      </w:r>
-      <w:r>
-        <w:rPr>
-          <w:rFonts w:ascii="Consolas" w:hAnsi="Consolas"/>
-          <w:i w:val="0"/>
-          <w:color w:val="2A5CA8"/>
-          <w:sz w:val="21"/>
-        </w:rPr>
-        <w:t>POST</w:t>
-      </w:r>
-    </w:p>
-    <w:p>
-      <w:r>
-        <w:rPr>
-          <w:b/>
-          <w:i w:val="0"/>
-          <w:sz w:val="21"/>
-        </w:rPr>
-        <w:t>Auth:</w:t>
-      </w:r>
-      <w:r>
-        <w:rPr>
-          <w:i w:val="0"/>
-          <w:sz w:val="21"/>
-        </w:rPr>
-        <w:t xml:space="preserve"> None (uses refreshToken in body)</w:t>
-      </w:r>
-    </w:p>
-    <w:p>
-      <w:r>
-        <w:rPr>
-          <w:b/>
-          <w:i w:val="0"/>
-          <w:sz w:val="21"/>
-        </w:rPr>
-        <w:t>Body:</w:t>
-      </w:r>
-    </w:p>
-    <w:p>
-      <w:pPr>
-        <w:spacing w:before="40" w:after="160"/>
-        <w:shd w:val="clear" w:color="auto" w:fill="F2F2F2"/>
-      </w:pPr>
-      <w:r>
-        <w:rPr>
-          <w:rFonts w:ascii="Consolas" w:hAnsi="Consolas"/>
-          <w:sz w:val="18"/>
-        </w:rPr>
-        <w:t>{ "refreshToken": "eyJhbGciOi..." }</w:t>
-      </w:r>
-      <w:r>
-        <w:br/>
-      </w:r>
-    </w:p>
-    <w:p>
-      <w:r>
-        <w:rPr>
-          <w:b/>
-          <w:i w:val="0"/>
-          <w:sz w:val="21"/>
-        </w:rPr>
-        <w:t>Response `200`:</w:t>
-      </w:r>
-    </w:p>
-    <w:p>
-      <w:pPr>
-        <w:spacing w:before="40" w:after="160"/>
-        <w:shd w:val="clear" w:color="auto" w:fill="F2F2F2"/>
-      </w:pPr>
-      <w:r>
-        <w:rPr>
-          <w:rFonts w:ascii="Consolas" w:hAnsi="Consolas"/>
-          <w:sz w:val="18"/>
-        </w:rPr>
-        <w:t>{ "success": true, "message": "Token refreshed", "data": { "accessToken": "eyJhbGciOi...", "refreshToken": "eyJhbGciOi..." } }</w:t>
-      </w:r>
-      <w:r>
-        <w:br/>
-      </w:r>
-    </w:p>
-    <w:p>
-      <w:pPr>
-        <w:ind w:left="360"/>
-      </w:pPr>
-      <w:r>
-        <w:rPr>
-          <w:i/>
-          <w:color w:val="555555"/>
-          <w:sz w:val="19"/>
-        </w:rPr>
-        <w:t xml:space="preserve">Access tokens never expire (no </w:t>
-      </w:r>
-      <w:r>
-        <w:rPr>
-          <w:rFonts w:ascii="Consolas" w:hAnsi="Consolas"/>
-          <w:i/>
-          <w:color w:val="2A5CA8"/>
-          <w:sz w:val="19"/>
-        </w:rPr>
-        <w:t>exp</w:t>
-      </w:r>
-      <w:r>
-        <w:rPr>
-          <w:i/>
-          <w:color w:val="555555"/>
-          <w:sz w:val="19"/>
-        </w:rPr>
-        <w:t xml:space="preserve"> claim), by explicit request — this endpoint should essentially never be needed. Refresh tokens still expire after 30 days. Security trade-off: a leaked access token is valid forever; the only way to invalidate one is rotating </w:t>
-      </w:r>
-      <w:r>
-        <w:rPr>
-          <w:rFonts w:ascii="Consolas" w:hAnsi="Consolas"/>
-          <w:i/>
-          <w:color w:val="2A5CA8"/>
-          <w:sz w:val="19"/>
-        </w:rPr>
-        <w:t>JWT_ACCESS_SECRET</w:t>
-      </w:r>
-      <w:r>
-        <w:rPr>
-          <w:i/>
-          <w:color w:val="555555"/>
-          <w:sz w:val="19"/>
-        </w:rPr>
-        <w:t xml:space="preserve"> server-side, which logs out everyone, not just the affected user.</w:t>
-      </w:r>
-    </w:p>
-    <w:p>
-      <w:pPr>
-        <w:pBdr>
-          <w:bottom w:val="single" w:sz="8" w:space="1" w:color="CCCCCC"/>
-        </w:pBdr>
-        <w:spacing w:before="80" w:after="240"/>
-      </w:pPr>
-    </w:p>
-    <w:p>
-      <w:pPr>
-        <w:pStyle w:val="Heading3"/>
-        <w:spacing w:before="280" w:after="120"/>
-      </w:pPr>
-      <w:r>
-        <w:rPr>
-          <w:color w:val="2A5CA8"/>
-        </w:rPr>
-        <w:t>34. Register FCM Push Token (alternative to endpoint 5)</w:t>
+        <w:t>33. Register FCM Push Token (alternative to endpoint 5)</w:t>
       </w:r>
     </w:p>
     <w:p>

</xml_diff>